<commit_message>
Ajout du nom de l'orateur dans la communication de l'Antenne Guinée
Co-Authored-By: Claude Opus 5.5 <noreply@anthropic.com>
Claude-Session: https://claude.ai/code/session_01Y44voEEgrqkDtN5faKYhcF
</commit_message>
<xml_diff>
--- a/Communication_Antenne_Guinee_Forum_Dakar_2026.docx
+++ b/Communication_Antenne_Guinee_Forum_Dakar_2026.docx
@@ -92,7 +92,7 @@
               <w:rPr>
                 <w:b/>
               </w:rPr>
-              <w:t>Orateur·rice</w:t>
+              <w:t>Orateur</w:t>
             </w:r>
           </w:p>
         </w:tc>
@@ -102,7 +102,16 @@
           </w:tcPr>
           <w:p>
             <w:r>
-              <w:t>[Nom, fonction]</w:t>
+              <w:rPr>
+                <w:b/>
+              </w:rPr>
+              <w:t>Mamadou BARRY</w:t>
+            </w:r>
+            <w:r>
+              <w:t xml:space="preserve"> , </w:t>
+            </w:r>
+            <w:r>
+              <w:t>[fonction au sein du GTFJPS-AOS/GN]</w:t>
             </w:r>
           </w:p>
         </w:tc>
@@ -953,7 +962,7 @@
           </w:tcPr>
           <w:p>
             <w:r>
-              <w:t>« Mesurer pour peser », logo du GT, nom de l’orateur·rice</w:t>
+              <w:t>« Mesurer pour peser », logo du GT, Mamadou BARRY, [fonction]</w:t>
             </w:r>
           </w:p>
         </w:tc>

</xml_diff>

<commit_message>
Ajout de la présentation de l'orateur en ouverture de la communication
Co-Authored-By: Claude Opus 5.5 <noreply@anthropic.com>
Claude-Session: https://claude.ai/code/session_01Y44voEEgrqkDtN5faKYhcF
</commit_message>
<xml_diff>
--- a/Communication_Antenne_Guinee_Forum_Dakar_2026.docx
+++ b/Communication_Antenne_Guinee_Forum_Dakar_2026.docx
@@ -331,6 +331,19 @@
       <w:r/>
       <w:r>
         <w:t>Mesdames et Messieurs, chères sœurs et chers frères activistes,</w:t>
+      </w:r>
+      <w:r/>
+    </w:p>
+    <w:p>
+      <w:r/>
+      <w:r>
+        <w:t xml:space="preserve">Je m’appelle Mamadou BARRY, </w:t>
+      </w:r>
+      <w:r>
+        <w:t>[fonction]</w:t>
+      </w:r>
+      <w:r>
+        <w:t xml:space="preserve"> au sein du Groupe de Travail Femmes, Jeunes, Paix et Sécurité en Afrique de l’Ouest et au Sahel, Antenne Guinée.</w:t>
       </w:r>
       <w:r/>
     </w:p>

</xml_diff>

<commit_message>
Intégration des activités de Guinée Impact à Mamou (janvier 2025) dans la communication
Co-Authored-By: Claude Opus 5.5 <noreply@anthropic.com>
Claude-Session: https://claude.ai/code/session_01Y44voEEgrqkDtN5faKYhcF
</commit_message>
<xml_diff>
--- a/Communication_Antenne_Guinee_Forum_Dakar_2026.docx
+++ b/Communication_Antenne_Guinee_Forum_Dakar_2026.docx
@@ -136,7 +136,7 @@
           </w:tcPr>
           <w:p>
             <w:r>
-              <w:t>8 à 10 minutes, puis questions</w:t>
+              <w:t>10 minutes, puis questions</w:t>
             </w:r>
           </w:p>
         </w:tc>
@@ -176,7 +176,7 @@
               <w:rPr>
                 <w:b/>
               </w:rPr>
-              <w:t>Source</w:t>
+              <w:t>Sources</w:t>
             </w:r>
           </w:p>
         </w:tc>
@@ -186,7 +186,7 @@
           </w:tcPr>
           <w:p>
             <w:r>
-              <w:t>Rapport annuel 2024 de l’Antenne Guinée et stratégie d’action validée à Somone</w:t>
+              <w:t>Rapport annuel 2024 de l’Antenne Guinée ; rapport d’activités de Guinée Impact à Mamou (janvier 2025) ; stratégie d’action validée à Somone</w:t>
             </w:r>
           </w:p>
         </w:tc>
@@ -204,16 +204,7 @@
         <w:t>Avant de présenter :</w:t>
       </w:r>
       <w:r>
-        <w:t xml:space="preserve"> les chiffres du rapport datent de </w:t>
-      </w:r>
-      <w:r>
-        <w:rPr>
-          <w:b/>
-        </w:rPr>
-        <w:t>2024</w:t>
-      </w:r>
-      <w:r>
-        <w:t>, alors que le forum a lieu en 2026. Si vous avez des résultats de 2025 ou 2026 (plateforme numérique en service, suites de la stratégie de plaidoyer, fin du projet FIFEP), ajoutez-les : ils rendront la communication beaucoup plus forte. Voir aussi l’encadré sur les chiffres à la section 3.</w:t>
+        <w:t xml:space="preserve"> le rapport de Guinée Impact (Mamou, janvier 2025) montre la stratégie de plaidoyer mise en œuvre sur le terrain. Si vous avez des résultats plus récents, de fin 2025 ou 2026 (plateforme numérique en service, fin du projet FIFEP), ajoutez-les aussi. Voir aussi l’encadré sur les chiffres à la section 3.</w:t>
       </w:r>
       <w:r/>
     </w:p>
@@ -272,10 +263,10 @@
         <w:rPr>
           <w:b/>
         </w:rPr>
-        <w:t>Le plaidoyer part du terrain.</w:t>
+        <w:t>Le plaidoyer part du terrain et y retourne.</w:t>
       </w:r>
       <w:r>
-        <w:t xml:space="preserve"> La stratégie nationale de plaidoyer a été bâtie à partir des plans locaux des 11 zones du projet FIFEP.</w:t>
+        <w:t xml:space="preserve"> La stratégie nationale de plaidoyer a été bâtie à partir des plans locaux des 11 zones du projet FIFEP, puis diffusée dans les communautés, comme à Mamou en janvier 2025.</w:t>
       </w:r>
       <w:r/>
     </w:p>
@@ -357,7 +348,7 @@
     <w:p>
       <w:r/>
       <w:r>
-        <w:t>Qui nous sommes (1 minute)</w:t>
+        <w:t>Qui nous sommes (30 secondes)</w:t>
       </w:r>
       <w:r/>
     </w:p>
@@ -371,7 +362,7 @@
     <w:p>
       <w:r/>
       <w:r>
-        <w:t>Première bonne pratique : mesurer (2 minutes 30)</w:t>
+        <w:t>Première bonne pratique : mesurer (2 minutes)</w:t>
       </w:r>
       <w:r/>
     </w:p>
@@ -408,7 +399,7 @@
     <w:p>
       <w:r/>
       <w:r>
-        <w:t>Deuxième bonne pratique : un plaidoyer qui part du terrain (1 minute 30)</w:t>
+        <w:t>Deuxième bonne pratique : un plaidoyer qui part du terrain et y retourne (2 minutes 30)</w:t>
       </w:r>
       <w:r/>
     </w:p>
@@ -443,6 +434,136 @@
       </w:r>
       <w:r>
         <w:t xml:space="preserve"> (FIFEP), puis validée avec tous les partenaires. Elle cible la gestion des conflits et la lutte contre les violences basées sur le genre.</w:t>
+      </w:r>
+      <w:r/>
+    </w:p>
+    <w:p>
+      <w:r/>
+      <w:r>
+        <w:t xml:space="preserve">Et cette stratégie n’est pas restée dans un tiroir. Du 16 au 20 janvier 2025, à Mamou, </w:t>
+      </w:r>
+      <w:r>
+        <w:rPr>
+          <w:b/>
+        </w:rPr>
+        <w:t>Guinée Impact</w:t>
+      </w:r>
+      <w:r>
+        <w:t>, organisation membre de notre Groupe de Travail, l’a portée jusqu’aux communautés en cinq jours :</w:t>
+      </w:r>
+      <w:r/>
+      <w:r/>
+    </w:p>
+    <w:p>
+      <w:pPr>
+        <w:pStyle w:val="ListBullet"/>
+        <w:spacing w:line="240" w:lineRule="auto"/>
+        <w:ind w:left="720"/>
+      </w:pPr>
+      <w:r/>
+      <w:r>
+        <w:t xml:space="preserve">une </w:t>
+      </w:r>
+      <w:r>
+        <w:rPr>
+          <w:b/>
+        </w:rPr>
+        <w:t>émission de radio interactive</w:t>
+      </w:r>
+      <w:r>
+        <w:t xml:space="preserve"> de deux heures, en direct ;</w:t>
+      </w:r>
+      <w:r/>
+    </w:p>
+    <w:p>
+      <w:pPr>
+        <w:pStyle w:val="ListBullet"/>
+        <w:spacing w:line="240" w:lineRule="auto"/>
+        <w:ind w:left="720"/>
+      </w:pPr>
+      <w:r/>
+      <w:r>
+        <w:t xml:space="preserve">une </w:t>
+      </w:r>
+      <w:r>
+        <w:rPr>
+          <w:b/>
+        </w:rPr>
+        <w:t>table ronde</w:t>
+      </w:r>
+      <w:r>
+        <w:t xml:space="preserve"> avec 30 femmes leaders, jeunes et membres d’organisations de la société civile ;</w:t>
+      </w:r>
+      <w:r/>
+    </w:p>
+    <w:p>
+      <w:pPr>
+        <w:pStyle w:val="ListBullet"/>
+        <w:spacing w:line="240" w:lineRule="auto"/>
+        <w:ind w:left="720"/>
+      </w:pPr>
+      <w:r/>
+      <w:r>
+        <w:t xml:space="preserve">un </w:t>
+      </w:r>
+      <w:r>
+        <w:rPr>
+          <w:b/>
+        </w:rPr>
+        <w:t>dialogue communautaire</w:t>
+      </w:r>
+      <w:r>
+        <w:t xml:space="preserve"> de 50 personnes, mené avec les leaders religieux, sur les résolutions 1325 et 2250 et les mutilations génitales féminines ;</w:t>
+      </w:r>
+      <w:r/>
+    </w:p>
+    <w:p>
+      <w:pPr>
+        <w:pStyle w:val="ListBullet"/>
+        <w:spacing w:line="240" w:lineRule="auto"/>
+        <w:ind w:left="720"/>
+      </w:pPr>
+      <w:r/>
+      <w:r>
+        <w:t xml:space="preserve">une </w:t>
+      </w:r>
+      <w:r>
+        <w:rPr>
+          <w:b/>
+        </w:rPr>
+        <w:t>soirée culturelle</w:t>
+      </w:r>
+      <w:r>
+        <w:t xml:space="preserve"> avec du théâtre en langue locale, devant plus de 100 personnes ;</w:t>
+      </w:r>
+      <w:r/>
+    </w:p>
+    <w:p>
+      <w:pPr>
+        <w:pStyle w:val="ListBullet"/>
+        <w:spacing w:line="240" w:lineRule="auto"/>
+        <w:ind w:left="720"/>
+      </w:pPr>
+      <w:r/>
+      <w:r>
+        <w:t xml:space="preserve">deux </w:t>
+      </w:r>
+      <w:r>
+        <w:rPr>
+          <w:b/>
+        </w:rPr>
+        <w:t>espaces de dialogue intergénérationnel</w:t>
+      </w:r>
+      <w:r>
+        <w:t xml:space="preserve"> entre femmes leaders et jeunes.</w:t>
+      </w:r>
+      <w:r/>
+      <w:r/>
+    </w:p>
+    <w:p>
+      <w:r/>
+      <w:r>
+        <w:t>Notre leçon : certaines personnes ont d’abord résisté aux messages, notamment sur les MGF. Ce sont le dialogue, la patience et l’appui des leaders religieux et communautaires qui ont fait la différence. Pour être entendu·es, il faut parler la langue des communautés, au sens propre comme au sens figuré.</w:t>
       </w:r>
       <w:r/>
     </w:p>
@@ -529,7 +650,7 @@
         <w:t>mobilisation insuffisante des autorités</w:t>
       </w:r>
       <w:r>
-        <w:t xml:space="preserve"> à certains moments clés ;</w:t>
+        <w:t xml:space="preserve"> à certains moments clés, et des participant·es difficiles à mobiliser au niveau local ;</w:t>
       </w:r>
       <w:r/>
     </w:p>
@@ -784,6 +905,137 @@
           <w:p>
             <w:r>
               <w:t>Élaborée et validée (août 2024)</w:t>
+            </w:r>
+          </w:p>
+        </w:tc>
+      </w:tr>
+      <w:tr>
+        <w:tc>
+          <w:tcPr>
+            <w:tcW w:type="dxa" w:w="4320"/>
+          </w:tcPr>
+          <w:p>
+            <w:r>
+              <w:rPr>
+                <w:b/>
+              </w:rPr>
+              <w:t>Diffusion à Mamou par Guinée Impact (16 au 20 janvier 2025)</w:t>
+            </w:r>
+          </w:p>
+        </w:tc>
+        <w:tc>
+          <w:tcPr>
+            <w:tcW w:type="dxa" w:w="4320"/>
+          </w:tcPr>
+          <w:p/>
+        </w:tc>
+      </w:tr>
+      <w:tr>
+        <w:tc>
+          <w:tcPr>
+            <w:tcW w:type="dxa" w:w="4320"/>
+          </w:tcPr>
+          <w:p>
+            <w:r>
+              <w:t>Émission de radio interactive</w:t>
+            </w:r>
+          </w:p>
+        </w:tc>
+        <w:tc>
+          <w:tcPr>
+            <w:tcW w:type="dxa" w:w="4320"/>
+          </w:tcPr>
+          <w:p>
+            <w:r>
+              <w:t>1 émission de 2 heures, en direct</w:t>
+            </w:r>
+          </w:p>
+        </w:tc>
+      </w:tr>
+      <w:tr>
+        <w:tc>
+          <w:tcPr>
+            <w:tcW w:type="dxa" w:w="4320"/>
+          </w:tcPr>
+          <w:p>
+            <w:r>
+              <w:t>Table ronde</w:t>
+            </w:r>
+          </w:p>
+        </w:tc>
+        <w:tc>
+          <w:tcPr>
+            <w:tcW w:type="dxa" w:w="4320"/>
+          </w:tcPr>
+          <w:p>
+            <w:r>
+              <w:t>30 participant·es</w:t>
+            </w:r>
+          </w:p>
+        </w:tc>
+      </w:tr>
+      <w:tr>
+        <w:tc>
+          <w:tcPr>
+            <w:tcW w:type="dxa" w:w="4320"/>
+          </w:tcPr>
+          <w:p>
+            <w:r>
+              <w:t>Dialogue communautaire avec les leaders religieux</w:t>
+            </w:r>
+          </w:p>
+        </w:tc>
+        <w:tc>
+          <w:tcPr>
+            <w:tcW w:type="dxa" w:w="4320"/>
+          </w:tcPr>
+          <w:p>
+            <w:r>
+              <w:t>50 participant·es</w:t>
+            </w:r>
+          </w:p>
+        </w:tc>
+      </w:tr>
+      <w:tr>
+        <w:tc>
+          <w:tcPr>
+            <w:tcW w:type="dxa" w:w="4320"/>
+          </w:tcPr>
+          <w:p>
+            <w:r>
+              <w:t>Soirée culturelle (théâtre en langue locale)</w:t>
+            </w:r>
+          </w:p>
+        </w:tc>
+        <w:tc>
+          <w:tcPr>
+            <w:tcW w:type="dxa" w:w="4320"/>
+          </w:tcPr>
+          <w:p>
+            <w:r>
+              <w:t>Plus de 100 personnes</w:t>
+            </w:r>
+          </w:p>
+        </w:tc>
+      </w:tr>
+      <w:tr>
+        <w:tc>
+          <w:tcPr>
+            <w:tcW w:type="dxa" w:w="4320"/>
+          </w:tcPr>
+          <w:p>
+            <w:r>
+              <w:t>Espaces de dialogue intergénérationnel</w:t>
+            </w:r>
+          </w:p>
+        </w:tc>
+        <w:tc>
+          <w:tcPr>
+            <w:tcW w:type="dxa" w:w="4320"/>
+          </w:tcPr>
+          <w:p>
+            <w:r>
+              <w:t>2</w:t>
             </w:r>
           </w:p>
         </w:tc>
@@ -1103,7 +1355,7 @@
           </w:tcPr>
           <w:p>
             <w:r>
-              <w:t>Schéma : 11 plans locaux → 1 stratégie nationale</w:t>
+              <w:t>Schéma : 11 plans locaux → 1 stratégie nationale → diffusion dans les communautés ; photos de Mamou (radio, dialogue, soirée culturelle) et chiffres de participation</w:t>
             </w:r>
           </w:p>
         </w:tc>
@@ -1284,6 +1536,28 @@
           </w:tcPr>
           <w:p>
             <w:r>
+              <w:t>Comment convaincre les communautés réticentes, par exemple sur les MGF ?</w:t>
+            </w:r>
+          </w:p>
+        </w:tc>
+        <w:tc>
+          <w:tcPr>
+            <w:tcW w:type="dxa" w:w="4320"/>
+          </w:tcPr>
+          <w:p>
+            <w:r>
+              <w:t>L’expérience de Mamou : passer par les leaders religieux et communautaires, parler en langue locale (théâtre, radio), et prendre le temps du dialogue plutôt que d’imposer un message.</w:t>
+            </w:r>
+          </w:p>
+        </w:tc>
+      </w:tr>
+      <w:tr>
+        <w:tc>
+          <w:tcPr>
+            <w:tcW w:type="dxa" w:w="4320"/>
+          </w:tcPr>
+          <w:p>
+            <w:r>
               <w:t>Comment dépendre moins des financements par projet ?</w:t>
             </w:r>
           </w:p>
@@ -1421,7 +1695,7 @@
           </w:tcPr>
           <w:p>
             <w:r>
-              <w:t>« Ce qui n’est pas mesuré n’est pas reconnu. » 11 zones, 20 organisations formées à l’alerte précoce, une stratégie nationale de plaidoyer construite à partir du terrain. La Guinée propose de partager ses indicateurs avec toute la région. #DeSomoneADakar</w:t>
+              <w:t>« Ce qui n’est pas mesuré n’est pas reconnu. » 11 zones, 20 organisations formées à l’alerte précoce, une stratégie nationale de plaidoyer construite à partir du terrain et diffusée jusqu’à Mamou par la radio, le théâtre et le dialogue avec les leaders religieux. La Guinée propose de partager ses indicateurs avec toute la région. #DeSomoneADakar</w:t>
             </w:r>
           </w:p>
         </w:tc>

</xml_diff>